<commit_message>
Actualizacion del archivo PARCIAL 2 SQL SERVER
</commit_message>
<xml_diff>
--- a/PARCIAL 2 SQL SERVER.docx
+++ b/PARCIAL 2 SQL SERVER.docx
@@ -1509,13 +1509,15 @@
           <w:rFonts w:ascii="Times New Roman" w:hAnsi="Times New Roman" w:cs="Times New Roman"/>
           <w:sz w:val="24"/>
           <w:szCs w:val="24"/>
-        </w:rPr>
-      </w:pPr>
-      <w:r>
-        <w:rPr>
-          <w:rFonts w:ascii="Times New Roman" w:hAnsi="Times New Roman" w:cs="Times New Roman"/>
-          <w:sz w:val="24"/>
-          <w:szCs w:val="24"/>
+          <w:lang w:val="en-US"/>
+        </w:rPr>
+      </w:pPr>
+      <w:r>
+        <w:rPr>
+          <w:rFonts w:ascii="Times New Roman" w:hAnsi="Times New Roman" w:cs="Times New Roman"/>
+          <w:sz w:val="24"/>
+          <w:szCs w:val="24"/>
+          <w:lang w:val="en-US"/>
         </w:rPr>
         <w:t xml:space="preserve">INSTRUCCIÓN SQL: </w:t>
       </w:r>
@@ -1526,16 +1528,40 @@
           <w:rFonts w:ascii="Times New Roman" w:hAnsi="Times New Roman" w:cs="Times New Roman"/>
           <w:sz w:val="24"/>
           <w:szCs w:val="24"/>
-        </w:rPr>
-      </w:pPr>
-      <w:r>
-        <w:rPr>
-          <w:rFonts w:ascii="Times New Roman" w:hAnsi="Times New Roman" w:cs="Times New Roman"/>
-          <w:sz w:val="24"/>
-          <w:szCs w:val="24"/>
-        </w:rPr>
-        <w:t>SELECT * FROM chofer;</w:t>
-      </w:r>
+          <w:lang w:val="en-US"/>
+        </w:rPr>
+      </w:pPr>
+      <w:r>
+        <w:rPr>
+          <w:rFonts w:ascii="Times New Roman" w:hAnsi="Times New Roman" w:cs="Times New Roman"/>
+          <w:sz w:val="24"/>
+          <w:szCs w:val="24"/>
+          <w:lang w:val="en-US"/>
+        </w:rPr>
+        <w:t xml:space="preserve">SELECT * FROM </w:t>
+      </w:r>
+      <w:proofErr w:type="spellStart"/>
+      <w:proofErr w:type="gramStart"/>
+      <w:r>
+        <w:rPr>
+          <w:rFonts w:ascii="Times New Roman" w:hAnsi="Times New Roman" w:cs="Times New Roman"/>
+          <w:sz w:val="24"/>
+          <w:szCs w:val="24"/>
+          <w:lang w:val="en-US"/>
+        </w:rPr>
+        <w:t>chofer</w:t>
+      </w:r>
+      <w:proofErr w:type="spellEnd"/>
+      <w:r>
+        <w:rPr>
+          <w:rFonts w:ascii="Times New Roman" w:hAnsi="Times New Roman" w:cs="Times New Roman"/>
+          <w:sz w:val="24"/>
+          <w:szCs w:val="24"/>
+          <w:lang w:val="en-US"/>
+        </w:rPr>
+        <w:t>;</w:t>
+      </w:r>
+      <w:proofErr w:type="gramEnd"/>
     </w:p>
     <w:p>
       <w:pPr>
@@ -1847,6 +1873,7 @@
       <w:r>
         <w:rPr>
           <w:rFonts w:ascii="Times New Roman" w:hAnsi="Times New Roman" w:cs="Times New Roman"/>
+          <w:noProof/>
           <w:sz w:val="24"/>
           <w:szCs w:val="24"/>
         </w:rPr>
@@ -2652,23 +2679,7 @@
           <w:sz w:val="24"/>
           <w:szCs w:val="24"/>
         </w:rPr>
-        <w:t xml:space="preserve">Mostrar todos los registros de la </w:t>
-      </w:r>
-      <w:r>
-        <w:rPr>
-          <w:rFonts w:ascii="Times New Roman" w:hAnsi="Times New Roman" w:cs="Times New Roman"/>
-          <w:sz w:val="24"/>
-          <w:szCs w:val="24"/>
-        </w:rPr>
-        <w:t>CHOFER</w:t>
-      </w:r>
-      <w:r>
-        <w:rPr>
-          <w:rFonts w:ascii="Times New Roman" w:hAnsi="Times New Roman" w:cs="Times New Roman"/>
-          <w:sz w:val="24"/>
-          <w:szCs w:val="24"/>
-        </w:rPr>
-        <w:t xml:space="preserve"> ordenados descendentemente:</w:t>
+        <w:t>Mostrar todos los registros de la CHOFER ordenados descendentemente:</w:t>
       </w:r>
     </w:p>
     <w:p>
@@ -2803,6 +2814,7 @@
       <w:r>
         <w:rPr>
           <w:rFonts w:ascii="Times New Roman" w:hAnsi="Times New Roman" w:cs="Times New Roman"/>
+          <w:noProof/>
           <w:sz w:val="24"/>
           <w:szCs w:val="24"/>
         </w:rPr>
@@ -3146,6 +3158,7 @@
       <w:r>
         <w:rPr>
           <w:rFonts w:ascii="Times New Roman" w:hAnsi="Times New Roman" w:cs="Times New Roman"/>
+          <w:noProof/>
           <w:sz w:val="24"/>
           <w:szCs w:val="24"/>
         </w:rPr>
@@ -3490,6 +3503,7 @@
       <w:r>
         <w:rPr>
           <w:rFonts w:ascii="Times New Roman" w:hAnsi="Times New Roman" w:cs="Times New Roman"/>
+          <w:noProof/>
           <w:sz w:val="24"/>
           <w:szCs w:val="24"/>
         </w:rPr>
@@ -4299,6 +4313,7 @@
       <w:r>
         <w:rPr>
           <w:rFonts w:ascii="Times New Roman" w:hAnsi="Times New Roman" w:cs="Times New Roman"/>
+          <w:noProof/>
           <w:sz w:val="24"/>
           <w:szCs w:val="24"/>
         </w:rPr>
@@ -4715,6 +4730,7 @@
       <w:r>
         <w:rPr>
           <w:rFonts w:ascii="Times New Roman" w:hAnsi="Times New Roman" w:cs="Times New Roman"/>
+          <w:noProof/>
           <w:sz w:val="24"/>
           <w:szCs w:val="24"/>
         </w:rPr>
@@ -5058,6 +5074,7 @@
       <w:r>
         <w:rPr>
           <w:rFonts w:ascii="Times New Roman" w:hAnsi="Times New Roman" w:cs="Times New Roman"/>
+          <w:noProof/>
           <w:sz w:val="24"/>
           <w:szCs w:val="24"/>
         </w:rPr>
@@ -5399,6 +5416,7 @@
       <w:r>
         <w:rPr>
           <w:rFonts w:ascii="Times New Roman" w:hAnsi="Times New Roman" w:cs="Times New Roman"/>
+          <w:noProof/>
           <w:sz w:val="24"/>
           <w:szCs w:val="24"/>
         </w:rPr>
@@ -5777,6 +5795,7 @@
       <w:r>
         <w:rPr>
           <w:rFonts w:ascii="Times New Roman" w:hAnsi="Times New Roman" w:cs="Times New Roman"/>
+          <w:noProof/>
           <w:sz w:val="24"/>
           <w:szCs w:val="24"/>
         </w:rPr>
@@ -6155,6 +6174,7 @@
       <w:r>
         <w:rPr>
           <w:rFonts w:ascii="Times New Roman" w:hAnsi="Times New Roman" w:cs="Times New Roman"/>
+          <w:noProof/>
           <w:sz w:val="24"/>
           <w:szCs w:val="24"/>
         </w:rPr>
@@ -6552,6 +6572,7 @@
       <w:r>
         <w:rPr>
           <w:rFonts w:ascii="Times New Roman" w:hAnsi="Times New Roman" w:cs="Times New Roman"/>
+          <w:noProof/>
           <w:sz w:val="24"/>
           <w:szCs w:val="24"/>
         </w:rPr>
@@ -6976,6 +6997,7 @@
       <w:r>
         <w:rPr>
           <w:rFonts w:ascii="Times New Roman" w:hAnsi="Times New Roman" w:cs="Times New Roman"/>
+          <w:noProof/>
           <w:sz w:val="24"/>
           <w:szCs w:val="24"/>
         </w:rPr>
@@ -7381,6 +7403,7 @@
       <w:r>
         <w:rPr>
           <w:rFonts w:ascii="Times New Roman" w:hAnsi="Times New Roman" w:cs="Times New Roman"/>
+          <w:noProof/>
           <w:sz w:val="24"/>
           <w:szCs w:val="24"/>
         </w:rPr>
@@ -8183,15 +8206,13 @@
           <w:rFonts w:ascii="Times New Roman" w:hAnsi="Times New Roman" w:cs="Times New Roman"/>
           <w:sz w:val="24"/>
           <w:szCs w:val="24"/>
-          <w:lang w:val="en-US"/>
-        </w:rPr>
-      </w:pPr>
-      <w:r>
-        <w:rPr>
-          <w:rFonts w:ascii="Times New Roman" w:hAnsi="Times New Roman" w:cs="Times New Roman"/>
-          <w:sz w:val="24"/>
-          <w:szCs w:val="24"/>
-          <w:lang w:val="en-US"/>
+        </w:rPr>
+      </w:pPr>
+      <w:r>
+        <w:rPr>
+          <w:rFonts w:ascii="Times New Roman" w:hAnsi="Times New Roman" w:cs="Times New Roman"/>
+          <w:sz w:val="24"/>
+          <w:szCs w:val="24"/>
         </w:rPr>
         <w:t>SELECT DISTINCT Nombre</w:t>
       </w:r>
@@ -8202,40 +8223,16 @@
           <w:rFonts w:ascii="Times New Roman" w:hAnsi="Times New Roman" w:cs="Times New Roman"/>
           <w:sz w:val="24"/>
           <w:szCs w:val="24"/>
-          <w:lang w:val="en-US"/>
-        </w:rPr>
-      </w:pPr>
-      <w:r>
-        <w:rPr>
-          <w:rFonts w:ascii="Times New Roman" w:hAnsi="Times New Roman" w:cs="Times New Roman"/>
-          <w:sz w:val="24"/>
-          <w:szCs w:val="24"/>
-          <w:lang w:val="en-US"/>
-        </w:rPr>
-        <w:t xml:space="preserve">FROM </w:t>
-      </w:r>
-      <w:proofErr w:type="spellStart"/>
-      <w:proofErr w:type="gramStart"/>
-      <w:r>
-        <w:rPr>
-          <w:rFonts w:ascii="Times New Roman" w:hAnsi="Times New Roman" w:cs="Times New Roman"/>
-          <w:sz w:val="24"/>
-          <w:szCs w:val="24"/>
-          <w:lang w:val="en-US"/>
-        </w:rPr>
-        <w:t>chofer</w:t>
-      </w:r>
-      <w:proofErr w:type="spellEnd"/>
-      <w:r>
-        <w:rPr>
-          <w:rFonts w:ascii="Times New Roman" w:hAnsi="Times New Roman" w:cs="Times New Roman"/>
-          <w:sz w:val="24"/>
-          <w:szCs w:val="24"/>
-          <w:lang w:val="en-US"/>
-        </w:rPr>
-        <w:t>;</w:t>
-      </w:r>
-      <w:proofErr w:type="gramEnd"/>
+        </w:rPr>
+      </w:pPr>
+      <w:r>
+        <w:rPr>
+          <w:rFonts w:ascii="Times New Roman" w:hAnsi="Times New Roman" w:cs="Times New Roman"/>
+          <w:sz w:val="24"/>
+          <w:szCs w:val="24"/>
+        </w:rPr>
+        <w:t>FROM chofer;</w:t>
+      </w:r>
     </w:p>
     <w:p>
       <w:pPr>
@@ -8282,6 +8279,7 @@
       <w:r>
         <w:rPr>
           <w:rFonts w:ascii="Times New Roman" w:hAnsi="Times New Roman" w:cs="Times New Roman"/>
+          <w:noProof/>
           <w:sz w:val="24"/>
           <w:szCs w:val="24"/>
         </w:rPr>
@@ -8599,6 +8597,7 @@
       <w:r>
         <w:rPr>
           <w:rFonts w:ascii="Times New Roman" w:hAnsi="Times New Roman" w:cs="Times New Roman"/>
+          <w:noProof/>
           <w:sz w:val="24"/>
           <w:szCs w:val="24"/>
         </w:rPr>
@@ -8807,13 +8806,15 @@
           <w:rFonts w:ascii="Times New Roman" w:hAnsi="Times New Roman" w:cs="Times New Roman"/>
           <w:sz w:val="24"/>
           <w:szCs w:val="24"/>
-        </w:rPr>
-      </w:pPr>
-      <w:r>
-        <w:rPr>
-          <w:rFonts w:ascii="Times New Roman" w:hAnsi="Times New Roman" w:cs="Times New Roman"/>
-          <w:sz w:val="24"/>
-          <w:szCs w:val="24"/>
+          <w:lang w:val="en-US"/>
+        </w:rPr>
+      </w:pPr>
+      <w:r>
+        <w:rPr>
+          <w:rFonts w:ascii="Times New Roman" w:hAnsi="Times New Roman" w:cs="Times New Roman"/>
+          <w:sz w:val="24"/>
+          <w:szCs w:val="24"/>
+          <w:lang w:val="en-US"/>
         </w:rPr>
         <w:t xml:space="preserve">INSTRUCCIÓN SQL: </w:t>
       </w:r>
@@ -8932,13 +8933,15 @@
           <w:rFonts w:ascii="Times New Roman" w:hAnsi="Times New Roman" w:cs="Times New Roman"/>
           <w:sz w:val="24"/>
           <w:szCs w:val="24"/>
-        </w:rPr>
-      </w:pPr>
-      <w:r>
-        <w:rPr>
-          <w:rFonts w:ascii="Times New Roman" w:hAnsi="Times New Roman" w:cs="Times New Roman"/>
-          <w:sz w:val="24"/>
-          <w:szCs w:val="24"/>
+          <w:lang w:val="en-US"/>
+        </w:rPr>
+      </w:pPr>
+      <w:r>
+        <w:rPr>
+          <w:rFonts w:ascii="Times New Roman" w:hAnsi="Times New Roman" w:cs="Times New Roman"/>
+          <w:sz w:val="24"/>
+          <w:szCs w:val="24"/>
+          <w:lang w:val="en-US"/>
         </w:rPr>
         <w:t>____________________________________</w:t>
       </w:r>
@@ -8971,6 +8974,7 @@
       <w:r>
         <w:rPr>
           <w:rFonts w:ascii="Times New Roman" w:hAnsi="Times New Roman" w:cs="Times New Roman"/>
+          <w:noProof/>
           <w:sz w:val="24"/>
           <w:szCs w:val="24"/>
         </w:rPr>
@@ -9224,15 +9228,13 @@
           <w:rFonts w:ascii="Times New Roman" w:hAnsi="Times New Roman" w:cs="Times New Roman"/>
           <w:sz w:val="24"/>
           <w:szCs w:val="24"/>
-          <w:lang w:val="en-US"/>
-        </w:rPr>
-      </w:pPr>
-      <w:r>
-        <w:rPr>
-          <w:rFonts w:ascii="Times New Roman" w:hAnsi="Times New Roman" w:cs="Times New Roman"/>
-          <w:sz w:val="24"/>
-          <w:szCs w:val="24"/>
-          <w:lang w:val="en-US"/>
+        </w:rPr>
+      </w:pPr>
+      <w:r>
+        <w:rPr>
+          <w:rFonts w:ascii="Times New Roman" w:hAnsi="Times New Roman" w:cs="Times New Roman"/>
+          <w:sz w:val="24"/>
+          <w:szCs w:val="24"/>
         </w:rPr>
         <w:t xml:space="preserve">SELECT * </w:t>
       </w:r>
@@ -9243,68 +9245,33 @@
           <w:rFonts w:ascii="Times New Roman" w:hAnsi="Times New Roman" w:cs="Times New Roman"/>
           <w:sz w:val="24"/>
           <w:szCs w:val="24"/>
-          <w:lang w:val="en-US"/>
-        </w:rPr>
-      </w:pPr>
-      <w:r>
-        <w:rPr>
-          <w:rFonts w:ascii="Times New Roman" w:hAnsi="Times New Roman" w:cs="Times New Roman"/>
-          <w:sz w:val="24"/>
-          <w:szCs w:val="24"/>
-          <w:lang w:val="en-US"/>
-        </w:rPr>
-        <w:t xml:space="preserve">FROM </w:t>
-      </w:r>
-      <w:proofErr w:type="spellStart"/>
-      <w:r>
-        <w:rPr>
-          <w:rFonts w:ascii="Times New Roman" w:hAnsi="Times New Roman" w:cs="Times New Roman"/>
-          <w:sz w:val="24"/>
-          <w:szCs w:val="24"/>
-          <w:lang w:val="en-US"/>
-        </w:rPr>
-        <w:t>chofer</w:t>
-      </w:r>
-      <w:proofErr w:type="spellEnd"/>
-      <w:r>
-        <w:rPr>
-          <w:rFonts w:ascii="Times New Roman" w:hAnsi="Times New Roman" w:cs="Times New Roman"/>
-          <w:sz w:val="24"/>
-          <w:szCs w:val="24"/>
-          <w:lang w:val="en-US"/>
-        </w:rPr>
-        <w:t xml:space="preserve"> </w:t>
-      </w:r>
-    </w:p>
-    <w:p>
-      <w:pPr>
-        <w:rPr>
-          <w:rFonts w:ascii="Times New Roman" w:hAnsi="Times New Roman" w:cs="Times New Roman"/>
-          <w:sz w:val="24"/>
-          <w:szCs w:val="24"/>
-          <w:lang w:val="en-US"/>
-        </w:rPr>
-      </w:pPr>
-      <w:r>
-        <w:rPr>
-          <w:rFonts w:ascii="Times New Roman" w:hAnsi="Times New Roman" w:cs="Times New Roman"/>
-          <w:sz w:val="24"/>
-          <w:szCs w:val="24"/>
-          <w:lang w:val="en-US"/>
-        </w:rPr>
-        <w:t>WHERE Nombre = 'Luis</w:t>
-      </w:r>
-      <w:proofErr w:type="gramStart"/>
-      <w:r>
-        <w:rPr>
-          <w:rFonts w:ascii="Times New Roman" w:hAnsi="Times New Roman" w:cs="Times New Roman"/>
-          <w:sz w:val="24"/>
-          <w:szCs w:val="24"/>
-          <w:lang w:val="en-US"/>
-        </w:rPr>
-        <w:t>';</w:t>
-      </w:r>
-      <w:proofErr w:type="gramEnd"/>
+        </w:rPr>
+      </w:pPr>
+      <w:r>
+        <w:rPr>
+          <w:rFonts w:ascii="Times New Roman" w:hAnsi="Times New Roman" w:cs="Times New Roman"/>
+          <w:sz w:val="24"/>
+          <w:szCs w:val="24"/>
+        </w:rPr>
+        <w:t xml:space="preserve">FROM chofer </w:t>
+      </w:r>
+    </w:p>
+    <w:p>
+      <w:pPr>
+        <w:rPr>
+          <w:rFonts w:ascii="Times New Roman" w:hAnsi="Times New Roman" w:cs="Times New Roman"/>
+          <w:sz w:val="24"/>
+          <w:szCs w:val="24"/>
+        </w:rPr>
+      </w:pPr>
+      <w:r>
+        <w:rPr>
+          <w:rFonts w:ascii="Times New Roman" w:hAnsi="Times New Roman" w:cs="Times New Roman"/>
+          <w:sz w:val="24"/>
+          <w:szCs w:val="24"/>
+        </w:rPr>
+        <w:t>WHERE Nombre = 'Luis';</w:t>
+      </w:r>
     </w:p>
     <w:p>
       <w:pPr>
@@ -9351,6 +9318,7 @@
       <w:r>
         <w:rPr>
           <w:rFonts w:ascii="Times New Roman" w:hAnsi="Times New Roman" w:cs="Times New Roman"/>
+          <w:noProof/>
           <w:sz w:val="24"/>
           <w:szCs w:val="24"/>
         </w:rPr>
@@ -9596,15 +9564,13 @@
           <w:rFonts w:ascii="Times New Roman" w:hAnsi="Times New Roman" w:cs="Times New Roman"/>
           <w:sz w:val="24"/>
           <w:szCs w:val="24"/>
-          <w:lang w:val="en-US"/>
-        </w:rPr>
-      </w:pPr>
-      <w:r>
-        <w:rPr>
-          <w:rFonts w:ascii="Times New Roman" w:hAnsi="Times New Roman" w:cs="Times New Roman"/>
-          <w:sz w:val="24"/>
-          <w:szCs w:val="24"/>
-          <w:lang w:val="en-US"/>
+        </w:rPr>
+      </w:pPr>
+      <w:r>
+        <w:rPr>
+          <w:rFonts w:ascii="Times New Roman" w:hAnsi="Times New Roman" w:cs="Times New Roman"/>
+          <w:sz w:val="24"/>
+          <w:szCs w:val="24"/>
         </w:rPr>
         <w:t xml:space="preserve">SELECT * </w:t>
       </w:r>
@@ -9615,68 +9581,33 @@
           <w:rFonts w:ascii="Times New Roman" w:hAnsi="Times New Roman" w:cs="Times New Roman"/>
           <w:sz w:val="24"/>
           <w:szCs w:val="24"/>
-          <w:lang w:val="en-US"/>
-        </w:rPr>
-      </w:pPr>
-      <w:r>
-        <w:rPr>
-          <w:rFonts w:ascii="Times New Roman" w:hAnsi="Times New Roman" w:cs="Times New Roman"/>
-          <w:sz w:val="24"/>
-          <w:szCs w:val="24"/>
-          <w:lang w:val="en-US"/>
-        </w:rPr>
-        <w:t xml:space="preserve">FROM </w:t>
-      </w:r>
-      <w:proofErr w:type="spellStart"/>
-      <w:r>
-        <w:rPr>
-          <w:rFonts w:ascii="Times New Roman" w:hAnsi="Times New Roman" w:cs="Times New Roman"/>
-          <w:sz w:val="24"/>
-          <w:szCs w:val="24"/>
-          <w:lang w:val="en-US"/>
-        </w:rPr>
-        <w:t>chofer</w:t>
-      </w:r>
-      <w:proofErr w:type="spellEnd"/>
-      <w:r>
-        <w:rPr>
-          <w:rFonts w:ascii="Times New Roman" w:hAnsi="Times New Roman" w:cs="Times New Roman"/>
-          <w:sz w:val="24"/>
-          <w:szCs w:val="24"/>
-          <w:lang w:val="en-US"/>
-        </w:rPr>
-        <w:t xml:space="preserve"> </w:t>
-      </w:r>
-    </w:p>
-    <w:p>
-      <w:pPr>
-        <w:rPr>
-          <w:rFonts w:ascii="Times New Roman" w:hAnsi="Times New Roman" w:cs="Times New Roman"/>
-          <w:sz w:val="24"/>
-          <w:szCs w:val="24"/>
-          <w:lang w:val="en-US"/>
-        </w:rPr>
-      </w:pPr>
-      <w:r>
-        <w:rPr>
-          <w:rFonts w:ascii="Times New Roman" w:hAnsi="Times New Roman" w:cs="Times New Roman"/>
-          <w:sz w:val="24"/>
-          <w:szCs w:val="24"/>
-          <w:lang w:val="en-US"/>
-        </w:rPr>
-        <w:t>WHERE Nombre &lt;&gt; 'Luis</w:t>
-      </w:r>
-      <w:proofErr w:type="gramStart"/>
-      <w:r>
-        <w:rPr>
-          <w:rFonts w:ascii="Times New Roman" w:hAnsi="Times New Roman" w:cs="Times New Roman"/>
-          <w:sz w:val="24"/>
-          <w:szCs w:val="24"/>
-          <w:lang w:val="en-US"/>
-        </w:rPr>
-        <w:t>';</w:t>
-      </w:r>
-      <w:proofErr w:type="gramEnd"/>
+        </w:rPr>
+      </w:pPr>
+      <w:r>
+        <w:rPr>
+          <w:rFonts w:ascii="Times New Roman" w:hAnsi="Times New Roman" w:cs="Times New Roman"/>
+          <w:sz w:val="24"/>
+          <w:szCs w:val="24"/>
+        </w:rPr>
+        <w:t xml:space="preserve">FROM chofer </w:t>
+      </w:r>
+    </w:p>
+    <w:p>
+      <w:pPr>
+        <w:rPr>
+          <w:rFonts w:ascii="Times New Roman" w:hAnsi="Times New Roman" w:cs="Times New Roman"/>
+          <w:sz w:val="24"/>
+          <w:szCs w:val="24"/>
+        </w:rPr>
+      </w:pPr>
+      <w:r>
+        <w:rPr>
+          <w:rFonts w:ascii="Times New Roman" w:hAnsi="Times New Roman" w:cs="Times New Roman"/>
+          <w:sz w:val="24"/>
+          <w:szCs w:val="24"/>
+        </w:rPr>
+        <w:t>WHERE Nombre &lt;&gt; 'Luis';</w:t>
+      </w:r>
     </w:p>
     <w:p>
       <w:pPr>
@@ -10090,6 +10021,7 @@
       <w:r>
         <w:rPr>
           <w:rFonts w:ascii="Times New Roman" w:hAnsi="Times New Roman" w:cs="Times New Roman"/>
+          <w:noProof/>
           <w:sz w:val="24"/>
           <w:szCs w:val="24"/>
         </w:rPr>
@@ -10921,6 +10853,7 @@
       <w:r>
         <w:rPr>
           <w:rFonts w:ascii="Times New Roman" w:hAnsi="Times New Roman" w:cs="Times New Roman"/>
+          <w:noProof/>
           <w:sz w:val="24"/>
           <w:szCs w:val="24"/>
         </w:rPr>
@@ -11196,13 +11129,15 @@
           <w:rFonts w:ascii="Times New Roman" w:hAnsi="Times New Roman" w:cs="Times New Roman"/>
           <w:sz w:val="24"/>
           <w:szCs w:val="24"/>
-        </w:rPr>
-      </w:pPr>
-      <w:r>
-        <w:rPr>
-          <w:rFonts w:ascii="Times New Roman" w:hAnsi="Times New Roman" w:cs="Times New Roman"/>
-          <w:sz w:val="24"/>
-          <w:szCs w:val="24"/>
+          <w:lang w:val="en-US"/>
+        </w:rPr>
+      </w:pPr>
+      <w:r>
+        <w:rPr>
+          <w:rFonts w:ascii="Times New Roman" w:hAnsi="Times New Roman" w:cs="Times New Roman"/>
+          <w:sz w:val="24"/>
+          <w:szCs w:val="24"/>
+          <w:lang w:val="en-US"/>
         </w:rPr>
         <w:t xml:space="preserve">INSTRUCCIÓN SQL: </w:t>
       </w:r>
@@ -11301,13 +11236,15 @@
           <w:rFonts w:ascii="Times New Roman" w:hAnsi="Times New Roman" w:cs="Times New Roman"/>
           <w:sz w:val="24"/>
           <w:szCs w:val="24"/>
-        </w:rPr>
-      </w:pPr>
-      <w:r>
-        <w:rPr>
-          <w:rFonts w:ascii="Times New Roman" w:hAnsi="Times New Roman" w:cs="Times New Roman"/>
-          <w:sz w:val="24"/>
-          <w:szCs w:val="24"/>
+          <w:lang w:val="en-US"/>
+        </w:rPr>
+      </w:pPr>
+      <w:r>
+        <w:rPr>
+          <w:rFonts w:ascii="Times New Roman" w:hAnsi="Times New Roman" w:cs="Times New Roman"/>
+          <w:sz w:val="24"/>
+          <w:szCs w:val="24"/>
+          <w:lang w:val="en-US"/>
         </w:rPr>
         <w:t>____________________________________</w:t>
       </w:r>
@@ -11340,6 +11277,7 @@
       <w:r>
         <w:rPr>
           <w:rFonts w:ascii="Times New Roman" w:hAnsi="Times New Roman" w:cs="Times New Roman"/>
+          <w:noProof/>
           <w:sz w:val="24"/>
           <w:szCs w:val="24"/>
         </w:rPr>
@@ -11718,6 +11656,7 @@
       <w:r>
         <w:rPr>
           <w:rFonts w:ascii="Times New Roman" w:hAnsi="Times New Roman" w:cs="Times New Roman"/>
+          <w:noProof/>
           <w:sz w:val="24"/>
           <w:szCs w:val="24"/>
         </w:rPr>
@@ -12056,15 +11995,24 @@
         </w:rPr>
         <w:t>WHERE REPORTES LIKE '%</w:t>
       </w:r>
-      <w:proofErr w:type="spellStart"/>
-      <w:r>
-        <w:rPr>
-          <w:rFonts w:ascii="Times New Roman" w:hAnsi="Times New Roman" w:cs="Times New Roman"/>
-          <w:sz w:val="24"/>
-          <w:szCs w:val="24"/>
-          <w:lang w:val="en-US"/>
-        </w:rPr>
-        <w:t>frenos</w:t>
+      <w:r>
+        <w:rPr>
+          <w:rFonts w:ascii="Times New Roman" w:hAnsi="Times New Roman" w:cs="Times New Roman"/>
+          <w:sz w:val="24"/>
+          <w:szCs w:val="24"/>
+          <w:lang w:val="en-US"/>
+        </w:rPr>
+        <w:t xml:space="preserve">Sin </w:t>
+      </w:r>
+      <w:proofErr w:type="spellStart"/>
+      <w:r>
+        <w:rPr>
+          <w:rFonts w:ascii="Times New Roman" w:hAnsi="Times New Roman" w:cs="Times New Roman"/>
+          <w:sz w:val="24"/>
+          <w:szCs w:val="24"/>
+          <w:lang w:val="en-US"/>
+        </w:rPr>
+        <w:t>novedades</w:t>
       </w:r>
       <w:proofErr w:type="spellEnd"/>
       <w:r>
@@ -12133,6 +12081,7 @@
       <w:r>
         <w:rPr>
           <w:rFonts w:ascii="Times New Roman" w:hAnsi="Times New Roman" w:cs="Times New Roman"/>
+          <w:noProof/>
           <w:sz w:val="24"/>
           <w:szCs w:val="24"/>
         </w:rPr>
@@ -12512,6 +12461,7 @@
       <w:r>
         <w:rPr>
           <w:rFonts w:ascii="Times New Roman" w:hAnsi="Times New Roman" w:cs="Times New Roman"/>
+          <w:noProof/>
           <w:sz w:val="24"/>
           <w:szCs w:val="24"/>
         </w:rPr>
@@ -12949,6 +12899,7 @@
       <w:r>
         <w:rPr>
           <w:rFonts w:ascii="Times New Roman" w:hAnsi="Times New Roman" w:cs="Times New Roman"/>
+          <w:noProof/>
           <w:sz w:val="24"/>
           <w:szCs w:val="24"/>
         </w:rPr>
@@ -13385,13 +13336,15 @@
           <w:rFonts w:ascii="Times New Roman" w:hAnsi="Times New Roman" w:cs="Times New Roman"/>
           <w:sz w:val="24"/>
           <w:szCs w:val="24"/>
-        </w:rPr>
-      </w:pPr>
-      <w:r>
-        <w:rPr>
-          <w:rFonts w:ascii="Times New Roman" w:hAnsi="Times New Roman" w:cs="Times New Roman"/>
-          <w:sz w:val="24"/>
-          <w:szCs w:val="24"/>
+          <w:lang w:val="en-US"/>
+        </w:rPr>
+      </w:pPr>
+      <w:r>
+        <w:rPr>
+          <w:rFonts w:ascii="Times New Roman" w:hAnsi="Times New Roman" w:cs="Times New Roman"/>
+          <w:sz w:val="24"/>
+          <w:szCs w:val="24"/>
+          <w:lang w:val="en-US"/>
         </w:rPr>
         <w:t xml:space="preserve">INSTRUCCIÓN SQL: </w:t>
       </w:r>
@@ -13510,13 +13463,15 @@
           <w:rFonts w:ascii="Times New Roman" w:hAnsi="Times New Roman" w:cs="Times New Roman"/>
           <w:sz w:val="24"/>
           <w:szCs w:val="24"/>
-        </w:rPr>
-      </w:pPr>
-      <w:r>
-        <w:rPr>
-          <w:rFonts w:ascii="Times New Roman" w:hAnsi="Times New Roman" w:cs="Times New Roman"/>
-          <w:sz w:val="24"/>
-          <w:szCs w:val="24"/>
+          <w:lang w:val="en-US"/>
+        </w:rPr>
+      </w:pPr>
+      <w:r>
+        <w:rPr>
+          <w:rFonts w:ascii="Times New Roman" w:hAnsi="Times New Roman" w:cs="Times New Roman"/>
+          <w:sz w:val="24"/>
+          <w:szCs w:val="24"/>
+          <w:lang w:val="en-US"/>
         </w:rPr>
         <w:t>____________________________________</w:t>
       </w:r>
@@ -13549,6 +13504,7 @@
       <w:r>
         <w:rPr>
           <w:rFonts w:ascii="Times New Roman" w:hAnsi="Times New Roman" w:cs="Times New Roman"/>
+          <w:noProof/>
           <w:sz w:val="24"/>
           <w:szCs w:val="24"/>
         </w:rPr>
@@ -14317,13 +14273,15 @@
           <w:rFonts w:ascii="Times New Roman" w:hAnsi="Times New Roman" w:cs="Times New Roman"/>
           <w:sz w:val="24"/>
           <w:szCs w:val="24"/>
-        </w:rPr>
-      </w:pPr>
-      <w:r>
-        <w:rPr>
-          <w:rFonts w:ascii="Times New Roman" w:hAnsi="Times New Roman" w:cs="Times New Roman"/>
-          <w:sz w:val="24"/>
-          <w:szCs w:val="24"/>
+          <w:lang w:val="en-US"/>
+        </w:rPr>
+      </w:pPr>
+      <w:r>
+        <w:rPr>
+          <w:rFonts w:ascii="Times New Roman" w:hAnsi="Times New Roman" w:cs="Times New Roman"/>
+          <w:sz w:val="24"/>
+          <w:szCs w:val="24"/>
+          <w:lang w:val="en-US"/>
         </w:rPr>
         <w:t xml:space="preserve">INSTRUCCIÓN SQL: </w:t>
       </w:r>
@@ -14984,6 +14942,7 @@
       <w:r>
         <w:rPr>
           <w:rFonts w:ascii="Times New Roman" w:hAnsi="Times New Roman" w:cs="Times New Roman"/>
+          <w:noProof/>
           <w:sz w:val="24"/>
           <w:szCs w:val="24"/>
         </w:rPr>
@@ -15210,13 +15169,15 @@
           <w:rFonts w:ascii="Times New Roman" w:hAnsi="Times New Roman" w:cs="Times New Roman"/>
           <w:sz w:val="24"/>
           <w:szCs w:val="24"/>
-        </w:rPr>
-      </w:pPr>
-      <w:r>
-        <w:rPr>
-          <w:rFonts w:ascii="Times New Roman" w:hAnsi="Times New Roman" w:cs="Times New Roman"/>
-          <w:sz w:val="24"/>
-          <w:szCs w:val="24"/>
+          <w:lang w:val="en-US"/>
+        </w:rPr>
+      </w:pPr>
+      <w:r>
+        <w:rPr>
+          <w:rFonts w:ascii="Times New Roman" w:hAnsi="Times New Roman" w:cs="Times New Roman"/>
+          <w:sz w:val="24"/>
+          <w:szCs w:val="24"/>
+          <w:lang w:val="en-US"/>
         </w:rPr>
         <w:lastRenderedPageBreak/>
         <w:t xml:space="preserve">INSTRUCCIÓN SQL: </w:t>
@@ -15967,6 +15928,7 @@
       <w:r>
         <w:rPr>
           <w:rFonts w:ascii="Times New Roman" w:hAnsi="Times New Roman" w:cs="Times New Roman"/>
+          <w:noProof/>
           <w:sz w:val="24"/>
           <w:szCs w:val="24"/>
         </w:rPr>
@@ -16237,13 +16199,15 @@
           <w:rFonts w:ascii="Times New Roman" w:hAnsi="Times New Roman" w:cs="Times New Roman"/>
           <w:sz w:val="24"/>
           <w:szCs w:val="24"/>
-        </w:rPr>
-      </w:pPr>
-      <w:r>
-        <w:rPr>
-          <w:rFonts w:ascii="Times New Roman" w:hAnsi="Times New Roman" w:cs="Times New Roman"/>
-          <w:sz w:val="24"/>
-          <w:szCs w:val="24"/>
+          <w:lang w:val="en-US"/>
+        </w:rPr>
+      </w:pPr>
+      <w:r>
+        <w:rPr>
+          <w:rFonts w:ascii="Times New Roman" w:hAnsi="Times New Roman" w:cs="Times New Roman"/>
+          <w:sz w:val="24"/>
+          <w:szCs w:val="24"/>
+          <w:lang w:val="en-US"/>
         </w:rPr>
         <w:t xml:space="preserve">INSTRUCCIÓN SQL: </w:t>
       </w:r>
@@ -16522,6 +16486,7 @@
       <w:r>
         <w:rPr>
           <w:rFonts w:ascii="Times New Roman" w:hAnsi="Times New Roman" w:cs="Times New Roman"/>
+          <w:noProof/>
           <w:sz w:val="24"/>
           <w:szCs w:val="24"/>
         </w:rPr>
@@ -16849,13 +16814,15 @@
           <w:rFonts w:ascii="Times New Roman" w:hAnsi="Times New Roman" w:cs="Times New Roman"/>
           <w:sz w:val="24"/>
           <w:szCs w:val="24"/>
-        </w:rPr>
-      </w:pPr>
-      <w:r>
-        <w:rPr>
-          <w:rFonts w:ascii="Times New Roman" w:hAnsi="Times New Roman" w:cs="Times New Roman"/>
-          <w:sz w:val="24"/>
-          <w:szCs w:val="24"/>
+          <w:lang w:val="en-US"/>
+        </w:rPr>
+      </w:pPr>
+      <w:r>
+        <w:rPr>
+          <w:rFonts w:ascii="Times New Roman" w:hAnsi="Times New Roman" w:cs="Times New Roman"/>
+          <w:sz w:val="24"/>
+          <w:szCs w:val="24"/>
+          <w:lang w:val="en-US"/>
         </w:rPr>
         <w:t xml:space="preserve">INSTRUCCIÓN SQL: </w:t>
       </w:r>
@@ -17138,6 +17105,7 @@
       <w:r>
         <w:rPr>
           <w:rFonts w:ascii="Times New Roman" w:hAnsi="Times New Roman" w:cs="Times New Roman"/>
+          <w:noProof/>
           <w:sz w:val="24"/>
           <w:szCs w:val="24"/>
         </w:rPr>
@@ -17317,6 +17285,52 @@
         </w:rPr>
         <w:t>____________________________________</w:t>
       </w:r>
+    </w:p>
+    <w:p>
+      <w:pPr>
+        <w:rPr>
+          <w:rFonts w:ascii="Times New Roman" w:hAnsi="Times New Roman" w:cs="Times New Roman"/>
+          <w:sz w:val="24"/>
+          <w:szCs w:val="24"/>
+        </w:rPr>
+      </w:pPr>
+    </w:p>
+    <w:p>
+      <w:pPr>
+        <w:rPr>
+          <w:rFonts w:ascii="Times New Roman" w:hAnsi="Times New Roman" w:cs="Times New Roman"/>
+          <w:sz w:val="24"/>
+          <w:szCs w:val="24"/>
+        </w:rPr>
+      </w:pPr>
+      <w:r>
+        <w:rPr>
+          <w:rFonts w:ascii="Times New Roman" w:hAnsi="Times New Roman" w:cs="Times New Roman"/>
+          <w:sz w:val="24"/>
+          <w:szCs w:val="24"/>
+        </w:rPr>
+        <w:t xml:space="preserve">VIDEO: </w:t>
+      </w:r>
+      <w:hyperlink r:id="rId47" w:history="1">
+        <w:r>
+          <w:rPr>
+            <w:rStyle w:val="Hipervnculo"/>
+            <w:rFonts w:ascii="Times New Roman" w:hAnsi="Times New Roman" w:cs="Times New Roman"/>
+            <w:sz w:val="24"/>
+            <w:szCs w:val="24"/>
+          </w:rPr>
+          <w:t>https://youtu.be/hvxWachdWjU</w:t>
+        </w:r>
+      </w:hyperlink>
+    </w:p>
+    <w:p>
+      <w:pPr>
+        <w:rPr>
+          <w:rFonts w:ascii="Times New Roman" w:hAnsi="Times New Roman" w:cs="Times New Roman"/>
+          <w:sz w:val="24"/>
+          <w:szCs w:val="24"/>
+        </w:rPr>
+      </w:pPr>
     </w:p>
     <w:sectPr>
       <w:pgSz w:w="12240" w:h="15840"/>
@@ -18436,6 +18450,7 @@
   <w:style w:type="character" w:default="1" w:styleId="Fuentedeprrafopredeter">
     <w:name w:val="Default Paragraph Font"/>
     <w:uiPriority w:val="1"/>
+    <w:semiHidden/>
     <w:unhideWhenUsed/>
   </w:style>
   <w:style w:type="table" w:default="1" w:styleId="Tablanormal">
@@ -18778,6 +18793,29 @@
     <w:basedOn w:val="Fuentedeprrafopredeter"/>
     <w:rsid w:val="00B97955"/>
   </w:style>
+  <w:style w:type="character" w:styleId="Hipervnculo">
+    <w:name w:val="Hyperlink"/>
+    <w:basedOn w:val="Fuentedeprrafopredeter"/>
+    <w:uiPriority w:val="99"/>
+    <w:unhideWhenUsed/>
+    <w:rsid w:val="00EA37E3"/>
+    <w:rPr>
+      <w:color w:val="0563C1" w:themeColor="hyperlink"/>
+      <w:u w:val="single"/>
+    </w:rPr>
+  </w:style>
+  <w:style w:type="character" w:styleId="Mencinsinresolver">
+    <w:name w:val="Unresolved Mention"/>
+    <w:basedOn w:val="Fuentedeprrafopredeter"/>
+    <w:uiPriority w:val="99"/>
+    <w:semiHidden/>
+    <w:unhideWhenUsed/>
+    <w:rsid w:val="00EA37E3"/>
+    <w:rPr>
+      <w:color w:val="605E5C"/>
+      <w:shd w:val="clear" w:color="auto" w:fill="E1DFDD"/>
+    </w:rPr>
+  </w:style>
 </w:styles>
 </file>
 

</xml_diff>